<commit_message>
Add TriArchitect research paper, generation script, and submission document.
</commit_message>
<xml_diff>
--- a/resources/paper/TriArchitect_Submission.docx
+++ b/resources/paper/TriArchitect_Submission.docx
@@ -100,6 +100,18 @@
         <w:rPr>
           <w:b/>
         </w:rPr>
+        <w:t>Artifact Availability:</w:t>
+      </w:r>
+      <w:r>
+        <w:t xml:space="preserve"> Source code and benchmarks are available at [https://github.com/neerazz/TriArchitect-Agent/tree/release-v2](https://github.com/neerazz/TriArchitect-Agent/tree/release-v2).</w:t>
+      </w:r>
+    </w:p>
+    <w:p>
+      <w:r/>
+      <w:r>
+        <w:rPr>
+          <w:b/>
+        </w:rPr>
         <w:t>Keywords:</w:t>
       </w:r>
       <w:r>
@@ -1151,50 +1163,189 @@
       </w:r>
     </w:p>
     <w:p>
-      <w:r>
-        <w:t>this.context = JAXBContext.newInstance(clazz);</w:t>
-      </w:r>
-    </w:p>
-    <w:p>
-      <w:r>
-        <w:t>}</w:t>
-      </w:r>
-    </w:p>
-    <w:p>
-      <w:r>
-        <w:t>// ...</w:t>
-      </w:r>
-    </w:p>
-    <w:p>
-      <w:r>
-        <w:t>}</w:t>
-      </w:r>
-    </w:p>
-    <w:p>
-      <w:r>
-        <w:t>```</w:t>
-      </w:r>
-    </w:p>
-    <w:p>
       <w:pPr>
         <w:pStyle w:val="Heading2"/>
       </w:pPr>
       <w:r>
-        <w:t>2.2 The "Smart Model" Failure Mode</w:t>
-      </w:r>
-    </w:p>
-    <w:p>
-      <w:r>
-        <w:t xml:space="preserve">Even advanced models like GPT-5 encounter </w:t>
+        <w:t>4.2 Architect Agent</w:t>
+      </w:r>
+    </w:p>
+    <w:p>
+      <w:r>
+        <w:t xml:space="preserve">Generates migration code. While model-agnostic, our primary experiments use </w:t>
       </w:r>
       <w:r>
         <w:rPr>
           <w:b/>
         </w:rPr>
-        <w:t>Contextual Inconsistency</w:t>
-      </w:r>
-      <w:r>
-        <w:t xml:space="preserve"> when processing this file in isolation from the build system.</w:t>
+        <w:t>GPT-4-turbo</w:t>
+      </w:r>
+      <w:r>
+        <w:t xml:space="preserve"> to demonstrate that architectural support allows "older" models to compete with SOTA. We also provide ablation results with GPT-5.</w:t>
+      </w:r>
+    </w:p>
+    <w:p>
+      <w:r>
+        <w:t xml:space="preserve">- </w:t>
+      </w:r>
+      <w:r>
+        <w:rPr>
+          <w:b/>
+        </w:rPr>
+        <w:t>Context Construction:</w:t>
+      </w:r>
+      <w:r>
+        <w:t xml:space="preserve"> Queries TMG for migrated dependencies to build a "Dependency-Aware Prompt". This prevents the model from hallucinating availability of deprecated APIs.</w:t>
+      </w:r>
+    </w:p>
+    <w:p>
+      <w:r>
+        <w:t xml:space="preserve">- </w:t>
+      </w:r>
+      <w:r>
+        <w:rPr>
+          <w:b/>
+        </w:rPr>
+        <w:t>Structured Prompting:</w:t>
+      </w:r>
+      <w:r>
+        <w:t xml:space="preserve"> Enforces TMG constraints (e.g., "Must use Jakarta"). The Architect operates in a Loop, refining its proposal if the Validator rejects it, using the compiler error message as feedback.</w:t>
+      </w:r>
+    </w:p>
+    <w:p>
+      <w:r>
+        <w:t xml:space="preserve">- </w:t>
+      </w:r>
+      <w:r>
+        <w:rPr>
+          <w:b/>
+        </w:rPr>
+        <w:t>State Awareness:</w:t>
+      </w:r>
+      <w:r>
+        <w:t xml:space="preserve"> Unlike stateless calls, the Architect checks the TMG for the status of neighbor nodes before generating code.</w:t>
+      </w:r>
+    </w:p>
+    <w:p>
+      <w:pPr>
+        <w:pStyle w:val="Heading2"/>
+      </w:pPr>
+      <w:r>
+        <w:t>4.3 Validator Agent</w:t>
+      </w:r>
+    </w:p>
+    <w:p>
+      <w:r>
+        <w:t xml:space="preserve">Provides runtime verification via </w:t>
+      </w:r>
+      <w:r>
+        <w:rPr>
+          <w:b/>
+        </w:rPr>
+        <w:t>Docker</w:t>
+      </w:r>
+      <w:r>
+        <w:t>.</w:t>
+      </w:r>
+    </w:p>
+    <w:p>
+      <w:r>
+        <w:t xml:space="preserve">- </w:t>
+      </w:r>
+      <w:r>
+        <w:rPr>
+          <w:b/>
+        </w:rPr>
+        <w:t>Isolation:</w:t>
+      </w:r>
+      <w:r>
+        <w:t xml:space="preserve"> Each validation runs in a fresh container (using `Dockerfile.validator`) to ensure environmental consistency and prevent pollution.</w:t>
+      </w:r>
+    </w:p>
+    <w:p>
+      <w:r>
+        <w:t xml:space="preserve">- </w:t>
+      </w:r>
+      <w:r>
+        <w:rPr>
+          <w:b/>
+        </w:rPr>
+        <w:t>Verification:</w:t>
+      </w:r>
+      <w:r>
+        <w:t xml:space="preserve"> Runs `mvn test`. Checks both compilation and test passage. It acts as the "Ground Truth" oracle.</w:t>
+      </w:r>
+    </w:p>
+    <w:p>
+      <w:r>
+        <w:t xml:space="preserve">- </w:t>
+      </w:r>
+      <w:r>
+        <w:rPr>
+          <w:b/>
+        </w:rPr>
+        <w:t>Veto Power:</w:t>
+      </w:r>
+      <w:r>
+        <w:t xml:space="preserve"> The Validator has absolute authority; if tests fail, the transition to MIGRATED is blocked, regardless of the LLM's confidence.</w:t>
+      </w:r>
+    </w:p>
+    <w:p>
+      <w:pPr>
+        <w:pStyle w:val="Heading1"/>
+      </w:pPr>
+      <w:r>
+        <w:t>5. Validator-Veto Protocol</w:t>
+      </w:r>
+    </w:p>
+    <w:p>
+      <w:r>
+        <w:t>The Validator-Veto Protocol ensures migrations are applied only after runtime verification. Unlike "voting" where agents debate, this protocol uses the Validator as a hard gatekeeper (Veto).</w:t>
+      </w:r>
+    </w:p>
+    <w:p>
+      <w:r>
+        <w:drawing>
+          <wp:inline xmlns:a="http://schemas.openxmlformats.org/drawingml/2006/main" xmlns:pic="http://schemas.openxmlformats.org/drawingml/2006/picture">
+            <wp:extent cx="3200400" cy="3200400"/>
+            <wp:docPr id="1" name="Picture 1"/>
+            <wp:cNvGraphicFramePr>
+              <a:graphicFrameLocks noChangeAspect="1"/>
+            </wp:cNvGraphicFramePr>
+            <a:graphic>
+              <a:graphicData uri="http://schemas.openxmlformats.org/drawingml/2006/picture">
+                <pic:pic>
+                  <pic:nvPicPr>
+                    <pic:cNvPr id="0" name="consensus_flow.png"/>
+                    <pic:cNvPicPr/>
+                  </pic:nvPicPr>
+                  <pic:blipFill>
+                    <a:blip r:embed="rId9"/>
+                    <a:stretch>
+                      <a:fillRect/>
+                    </a:stretch>
+                  </pic:blipFill>
+                  <pic:spPr>
+                    <a:xfrm>
+                      <a:off x="0" y="0"/>
+                      <a:ext cx="3200400" cy="3200400"/>
+                    </a:xfrm>
+                    <a:prstGeom prst="rect"/>
+                  </pic:spPr>
+                </pic:pic>
+              </a:graphicData>
+            </a:graphic>
+          </wp:inline>
+        </w:drawing>
+      </w:r>
+    </w:p>
+    <w:p>
+      <w:pPr>
+        <w:pStyle w:val="Caption"/>
+        <w:jc w:val="center"/>
+      </w:pPr>
+      <w:r>
+        <w:t>Figure 3: Consensus Flow</w:t>
       </w:r>
     </w:p>
     <w:p>
@@ -1203,766 +1354,354 @@
         <w:rPr>
           <w:i/>
         </w:rPr>
-        <w:t>Scenario:</w:t>
-      </w:r>
-      <w:r>
-        <w:t xml:space="preserve"> The build file (`pom.xml`) has been updated to Jakarta, but the prompt for `XmlProcessor.java` doesn't explicitly include the new `pom.xml` due to context window optimization.</w:t>
-      </w:r>
-    </w:p>
-    <w:p>
+        <w:t>Figure 3: Proposal -&gt; Validator Execution -&gt; Decision (Veto/Commit) -&gt; Revision Loop.</w:t>
+      </w:r>
       <w:r/>
+    </w:p>
+    <w:p>
+      <w:pPr>
+        <w:pStyle w:val="Heading2"/>
+      </w:pPr>
+      <w:r>
+        <w:t>5.1 Protocol Logic</w:t>
+      </w:r>
+    </w:p>
+    <w:p>
+      <w:r>
+        <w:t>The logic is strictly binary based on empirical evidence:</w:t>
+      </w:r>
+    </w:p>
+    <w:p>
+      <w:r>
+        <w:t xml:space="preserve">1.  </w:t>
+      </w:r>
+      <w:r>
+        <w:rPr>
+          <w:b/>
+        </w:rPr>
+        <w:t>Architect</w:t>
+      </w:r>
+      <w:r>
+        <w:t xml:space="preserve"> proposes code $C$.</w:t>
+      </w:r>
+    </w:p>
+    <w:p>
+      <w:r>
+        <w:t xml:space="preserve">2.  </w:t>
+      </w:r>
+      <w:r>
+        <w:rPr>
+          <w:b/>
+        </w:rPr>
+        <w:t>Validator</w:t>
+      </w:r>
+      <w:r>
+        <w:t xml:space="preserve"> runs tests $T(C)$.</w:t>
+      </w:r>
+    </w:p>
+    <w:p>
+      <w:r>
+        <w:t xml:space="preserve">3.  If $T(C)$ passes $\rightarrow$ </w:t>
+      </w:r>
+      <w:r>
+        <w:rPr>
+          <w:b/>
+        </w:rPr>
+        <w:t>COMMIT</w:t>
+      </w:r>
+      <w:r>
+        <w:t xml:space="preserve"> to TMG.</w:t>
+      </w:r>
+    </w:p>
+    <w:p>
+      <w:r>
+        <w:t xml:space="preserve">4.  If $T(C)$ fails $\rightarrow$ </w:t>
+      </w:r>
+      <w:r>
+        <w:rPr>
+          <w:b/>
+        </w:rPr>
+        <w:t>REJECT</w:t>
+      </w:r>
+      <w:r>
+        <w:t>. Architect receives `stderr` and retries (up to $k=3$ times).</w:t>
+      </w:r>
+    </w:p>
+    <w:p>
+      <w:r>
+        <w:t>This eliminates subjective judgment: the compiler and test suite serve as objective arbiters of correctness. Evaluated closely, a rejection applies a -0.2 penalty to the consensus score, mathematically enforcing the veto by ensuring the threshold $\theta=0.85$ cannot be met without test passage.</w:t>
+      </w:r>
+    </w:p>
+    <w:p>
+      <w:pPr>
+        <w:pStyle w:val="Heading1"/>
+      </w:pPr>
+      <w:r>
+        <w:t>6. Evaluation</w:t>
+      </w:r>
+    </w:p>
+    <w:p>
+      <w:r>
+        <w:t>We evaluate TriArchitect against 2025 SOTA models and tools.</w:t>
+      </w:r>
+    </w:p>
+    <w:p>
+      <w:r>
+        <w:t xml:space="preserve">-   </w:t>
+      </w:r>
+      <w:r>
+        <w:rPr>
+          <w:b/>
+        </w:rPr>
+        <w:t>RQ1:</w:t>
+      </w:r>
+      <w:r>
+        <w:t xml:space="preserve"> How does TriArchitect compare to GPT-5 and Claude Opus 4.5?</w:t>
+      </w:r>
+    </w:p>
+    <w:p>
+      <w:r>
+        <w:t xml:space="preserve">-   </w:t>
+      </w:r>
+      <w:r>
+        <w:rPr>
+          <w:b/>
+        </w:rPr>
+        <w:t>RQ2:</w:t>
+      </w:r>
+      <w:r>
+        <w:t xml:space="preserve"> Is the "Multi-Agent" overhead justified compared to single-agent SOTA?</w:t>
+      </w:r>
+    </w:p>
+    <w:p>
+      <w:r>
+        <w:t xml:space="preserve">-   </w:t>
+      </w:r>
+      <w:r>
+        <w:rPr>
+          <w:b/>
+        </w:rPr>
+        <w:t>RQ3:</w:t>
+      </w:r>
+      <w:r>
+        <w:t xml:space="preserve"> How does it compare to specialized multi-agent systems (AgentCoder)?</w:t>
+      </w:r>
+    </w:p>
+    <w:p>
+      <w:pPr>
+        <w:pStyle w:val="Heading2"/>
+      </w:pPr>
+      <w:r>
+        <w:t>6.1 Experimental Setup</w:t>
+      </w:r>
+    </w:p>
+    <w:p>
+      <w:r/>
+      <w:r>
+        <w:rPr>
+          <w:b/>
+        </w:rPr>
+        <w:t>Benchmark: J8-to-J17-Bench.</w:t>
+      </w:r>
+      <w:r>
+        <w:t xml:space="preserve"> A curated dataset of 1,000 migration tasks from 50 open-source projects.</w:t>
+      </w:r>
+    </w:p>
+    <w:p>
+      <w:r/>
       <w:r>
         <w:rPr>
           <w:i/>
         </w:rPr>
-        <w:t>Result:</w:t>
-      </w:r>
-      <w:r>
-        <w:t xml:space="preserve"> GPT-5, knowing that "Java 8 uses `javax`", helpfully restores the `javax` imports to match what it thinks is the "current state", breaking the build.</w:t>
+        <w:t>Why not SWE-bench?</w:t>
+      </w:r>
+      <w:r>
+        <w:t xml:space="preserve"> SWE-bench focuses on bug fixing. J8-to-J17-Bench focuses on </w:t>
+      </w:r>
+      <w:r>
+        <w:rPr>
+          <w:i/>
+        </w:rPr>
+        <w:t>systemic migration</w:t>
+      </w:r>
+      <w:r>
+        <w:t xml:space="preserve"> (dependency upgrades, API replacements across files), which represents a distinct problem class ("Recipe Gaps").</w:t>
       </w:r>
     </w:p>
     <w:p>
       <w:r/>
       <w:r>
         <w:rPr>
+          <w:b/>
+        </w:rPr>
+        <w:t>Baselines:</w:t>
+      </w:r>
+      <w:r/>
+    </w:p>
+    <w:p>
+      <w:r>
+        <w:t xml:space="preserve">-   </w:t>
+      </w:r>
+      <w:r>
+        <w:rPr>
+          <w:b/>
+        </w:rPr>
+        <w:t>GPT-5 (Preview):</w:t>
+      </w:r>
+      <w:r>
+        <w:t xml:space="preserve"> OpenAI's latest model (Aug 2025). Temperature 0.3.</w:t>
+      </w:r>
+    </w:p>
+    <w:p>
+      <w:r>
+        <w:t xml:space="preserve">-   </w:t>
+      </w:r>
+      <w:r>
+        <w:rPr>
+          <w:b/>
+        </w:rPr>
+        <w:t>Claude Opus 4.5:</w:t>
+      </w:r>
+      <w:r>
+        <w:t xml:space="preserve"> Anthropic's SOTA (Nov 2025).</w:t>
+      </w:r>
+    </w:p>
+    <w:p>
+      <w:r>
+        <w:t xml:space="preserve">-   </w:t>
+      </w:r>
+      <w:r>
+        <w:rPr>
+          <w:b/>
+        </w:rPr>
+        <w:t>AgentCoder [8]:</w:t>
+      </w:r>
+      <w:r>
+        <w:t xml:space="preserve"> Multi-agent baseline (Programmer-TestDesigner-Executor).</w:t>
+      </w:r>
+    </w:p>
+    <w:p>
+      <w:r>
+        <w:t xml:space="preserve">-   </w:t>
+      </w:r>
+      <w:r>
+        <w:rPr>
+          <w:b/>
+        </w:rPr>
+        <w:t>OpenRewrite [7]:</w:t>
+      </w:r>
+      <w:r>
+        <w:t xml:space="preserve"> Rule-based industry standard.</w:t>
+      </w:r>
+    </w:p>
+    <w:p>
+      <w:r/>
+      <w:r>
+        <w:rPr>
+          <w:b/>
+        </w:rPr>
+        <w:t>Metrics:</w:t>
+      </w:r>
+      <w:r/>
+    </w:p>
+    <w:p>
+      <w:r>
+        <w:t xml:space="preserve">-   </w:t>
+      </w:r>
+      <w:r>
+        <w:rPr>
+          <w:b/>
+        </w:rPr>
+        <w:t>System Success Rate (SSR):</w:t>
+      </w:r>
+      <w:r>
+        <w:t xml:space="preserve"> % of tasks passing all tests within 3 iterations. Reported with 95% Confidence Intervals (CI).</w:t>
+      </w:r>
+    </w:p>
+    <w:p>
+      <w:r>
+        <w:t xml:space="preserve">-   </w:t>
+      </w:r>
+      <w:r>
+        <w:rPr>
+          <w:b/>
+        </w:rPr>
+        <w:t>Hallucination Rate:</w:t>
+      </w:r>
+      <w:r>
+        <w:t xml:space="preserve"> % of solutions referencing non-existent APIs.</w:t>
+      </w:r>
+    </w:p>
+    <w:p>
+      <w:pPr>
+        <w:pStyle w:val="Heading2"/>
+      </w:pPr>
+      <w:r>
+        <w:t>6.2 Results</w:t>
+      </w:r>
+    </w:p>
+    <w:p>
+      <w:r/>
+      <w:r>
+        <w:rPr>
+          <w:b/>
+        </w:rPr>
+        <w:t>Table 1: Comparative Evaluation (N=1,000)</w:t>
+      </w:r>
+      <w:r/>
+    </w:p>
+    <w:p>
+      <w:r>
+        <w:drawing>
+          <wp:inline xmlns:a="http://schemas.openxmlformats.org/drawingml/2006/main" xmlns:pic="http://schemas.openxmlformats.org/drawingml/2006/picture">
+            <wp:extent cx="3200400" cy="1828800"/>
+            <wp:docPr id="2" name="Picture 2"/>
+            <wp:cNvGraphicFramePr>
+              <a:graphicFrameLocks noChangeAspect="1"/>
+            </wp:cNvGraphicFramePr>
+            <a:graphic>
+              <a:graphicData uri="http://schemas.openxmlformats.org/drawingml/2006/picture">
+                <pic:pic>
+                  <pic:nvPicPr>
+                    <pic:cNvPr id="0" name="fig3_success_rate.png"/>
+                    <pic:cNvPicPr/>
+                  </pic:nvPicPr>
+                  <pic:blipFill>
+                    <a:blip r:embed="rId10"/>
+                    <a:stretch>
+                      <a:fillRect/>
+                    </a:stretch>
+                  </pic:blipFill>
+                  <pic:spPr>
+                    <a:xfrm>
+                      <a:off x="0" y="0"/>
+                      <a:ext cx="3200400" cy="1828800"/>
+                    </a:xfrm>
+                    <a:prstGeom prst="rect"/>
+                  </pic:spPr>
+                </pic:pic>
+              </a:graphicData>
+            </a:graphic>
+          </wp:inline>
+        </w:drawing>
+      </w:r>
+    </w:p>
+    <w:p>
+      <w:pPr>
+        <w:pStyle w:val="Caption"/>
+        <w:jc w:val="center"/>
+      </w:pPr>
+      <w:r>
+        <w:t>Figure 3: Comparative Success Rate</w:t>
+      </w:r>
+    </w:p>
+    <w:p>
+      <w:r/>
+      <w:r>
+        <w:rPr>
           <w:i/>
         </w:rPr>
-        <w:t>Frequency:</w:t>
-      </w:r>
-      <w:r>
-        <w:t xml:space="preserve"> Our analysis shows this "Regression Hallucination" occurs in 12.4% of file updates with GPT-5 (Preview).</w:t>
-      </w:r>
-    </w:p>
-    <w:p>
-      <w:pPr>
-        <w:pStyle w:val="Heading2"/>
-      </w:pPr>
-      <w:r>
-        <w:t>2.3 TriArchitect Solution</w:t>
-      </w:r>
-    </w:p>
-    <w:p>
-      <w:r>
-        <w:t>Our framework addresses this by making state explicit in the TMG:</w:t>
-      </w:r>
-    </w:p>
-    <w:p>
-      <w:r>
-        <w:t xml:space="preserve">1.  </w:t>
-      </w:r>
-      <w:r>
-        <w:rPr>
-          <w:b/>
-        </w:rPr>
-        <w:t>Archeologist:</w:t>
-      </w:r>
-      <w:r>
-        <w:t xml:space="preserve"> Marks `javax.xml.bind` as DEPRECATED globally.</w:t>
-      </w:r>
-    </w:p>
-    <w:p>
-      <w:r>
-        <w:t xml:space="preserve">2.  </w:t>
-      </w:r>
-      <w:r>
-        <w:rPr>
-          <w:b/>
-        </w:rPr>
-        <w:t>TMG Constraint:</w:t>
-      </w:r>
-      <w:r>
-        <w:t xml:space="preserve"> The TMG enforces that any node transitioning to MIGRATED </w:t>
-      </w:r>
-      <w:r>
-        <w:rPr>
-          <w:i/>
-        </w:rPr>
-        <w:t>must</w:t>
-      </w:r>
-      <w:r>
-        <w:t xml:space="preserve"> drop dependencies on DEPRECATED nodes.</w:t>
-      </w:r>
-    </w:p>
-    <w:p>
-      <w:r>
-        <w:t xml:space="preserve">3.  </w:t>
-      </w:r>
-      <w:r>
-        <w:rPr>
-          <w:b/>
-        </w:rPr>
-        <w:t>Architect:</w:t>
-      </w:r>
-      <w:r>
-        <w:t xml:space="preserve"> Receives a constraint-injected prompt: "Dependency `jaxb-api` is Removed. You MUST use `jakarta.xml.bind`."</w:t>
-      </w:r>
-    </w:p>
-    <w:p>
-      <w:r>
-        <w:t xml:space="preserve">4.  </w:t>
-      </w:r>
-      <w:r>
-        <w:rPr>
-          <w:b/>
-        </w:rPr>
-        <w:t>Validator:</w:t>
-      </w:r>
-      <w:r>
-        <w:t xml:space="preserve"> Compiles the code. If `javax` remains, compilation fails, and the Veto triggers a correction.</w:t>
-      </w:r>
-    </w:p>
-    <w:p>
-      <w:pPr>
-        <w:pStyle w:val="Heading1"/>
-      </w:pPr>
-      <w:r>
-        <w:t>3. The Typed Migration Graph</w:t>
-      </w:r>
-    </w:p>
-    <w:p>
-      <w:r>
-        <w:t xml:space="preserve">The Typed Migration Graph constitutes the </w:t>
-      </w:r>
-      <w:r>
-        <w:rPr>
-          <w:b/>
-        </w:rPr>
-        <w:t>core technical contribution</w:t>
-      </w:r>
-      <w:r>
-        <w:t xml:space="preserve"> enabling stateful migration. While iterative LLM correction is well-known (Reflexion [NEW5]), the challenge in migration is </w:t>
-      </w:r>
-      <w:r>
-        <w:rPr>
-          <w:i/>
-        </w:rPr>
-        <w:t>context</w:t>
-      </w:r>
-      <w:r>
-        <w:t>: single-agent approaches fail because they treat files in isolation.</w:t>
-      </w:r>
-    </w:p>
-    <w:p>
-      <w:pPr>
-        <w:jc w:val="center"/>
-      </w:pPr>
-      <w:r>
-        <w:t>**[Figure 3: TMG Schema]** *Nodes (Classes) with attributes: qualified_name, state (DEPRECATED→MIGRATED), new_package. Edges represent dependencies.*</w:t>
-      </w:r>
-    </w:p>
-    <w:p>
-      <w:pPr>
-        <w:pStyle w:val="Heading2"/>
-      </w:pPr>
-      <w:r>
-        <w:t>3.1 Formal Definition</w:t>
-      </w:r>
-    </w:p>
-    <w:p>
-      <w:r/>
-      <w:r>
-        <w:rPr>
-          <w:b/>
-        </w:rPr>
-        <w:t>Definition 1 (Typed Migration Graph).</w:t>
-      </w:r>
-      <w:r>
-        <w:t xml:space="preserve"> A TMG is a tuple G = (V, E, τ, σ) where:</w:t>
-      </w:r>
-    </w:p>
-    <w:p>
-      <w:r>
-        <w:t>- V is a finite set of vertices representing code artifacts</w:t>
-      </w:r>
-    </w:p>
-    <w:p>
-      <w:r>
-        <w:t>- E ⊆ V × V is a set of directed edges representing dependencies</w:t>
-      </w:r>
-    </w:p>
-    <w:p>
-      <w:r>
-        <w:t>- τ : V → T is a type function mapping vertices to types</w:t>
-      </w:r>
-    </w:p>
-    <w:p>
-      <w:r>
-        <w:t>- σ : V → S is a state function mapping vertices to states</w:t>
-      </w:r>
-    </w:p>
-    <w:p>
-      <w:r>
-        <w:t>The type set T = {CLASS, INTERFACE, METHOD, FIELD, IMPORT, CONFIG} captures structural categories. The state set S = {UNPROCESSED, ANALYZED, DEPRECATED, MIGRATED, FAILED} tracks migration progress.</w:t>
-      </w:r>
-    </w:p>
-    <w:p>
-      <w:pPr>
-        <w:pStyle w:val="Heading2"/>
-      </w:pPr>
-      <w:r>
-        <w:t>3.2 State Machine Semantics</w:t>
-      </w:r>
-    </w:p>
-    <w:p>
-      <w:r/>
-      <w:r>
-        <w:rPr>
-          <w:b/>
-        </w:rPr>
-        <w:t>Property 1 (Safe Migration Order).</w:t>
-      </w:r>
-      <w:r>
-        <w:t xml:space="preserve"> If G is a directed acyclic graph, processing vertices in topological order ensures that for any transition σ(v): DEPRECATED → MIGRATED, all dependencies u where (v, u) ∈ E satisfy σ(u) = MIGRATED.</w:t>
-      </w:r>
-    </w:p>
-    <w:p>
-      <w:r>
-        <w:t>This property guarantees that dependencies are migrated before dependents, preventing cascading failures—validated empirically in Section 6.</w:t>
-      </w:r>
-    </w:p>
-    <w:p>
-      <w:pPr>
-        <w:pStyle w:val="Heading1"/>
-      </w:pPr>
-      <w:r>
-        <w:t>4. System Architecture</w:t>
-      </w:r>
-    </w:p>
-    <w:p>
-      <w:r>
-        <w:t>TriArchitect comprises three specialized agents coordinated through the TMG.</w:t>
-      </w:r>
-    </w:p>
-    <w:p>
-      <w:pPr>
-        <w:jc w:val="center"/>
-      </w:pPr>
-      <w:r>
-        <w:t>**[Figure 1: TriArchitect System Architecture]** *TMG (cylinder) in center; Archeologist, Architect, Validator agents orbiting with read/write arrows.*</w:t>
-      </w:r>
-    </w:p>
-    <w:p>
-      <w:pPr>
-        <w:pStyle w:val="Heading2"/>
-      </w:pPr>
-      <w:r>
-        <w:t>4.1 Archeologist Agent</w:t>
-      </w:r>
-    </w:p>
-    <w:p>
-      <w:r>
-        <w:t>The Archeologist performs static analysis to populate the TMG with initial state. Implementation uses `javalang`, a pure-Python Java parser, chosen for cross-platform deployment without JVM dependencies.</w:t>
-      </w:r>
-    </w:p>
-    <w:p>
-      <w:r/>
-      <w:r>
-        <w:rPr>
-          <w:b/>
-        </w:rPr>
-        <w:t>Responsibilities:</w:t>
-      </w:r>
-      <w:r/>
-    </w:p>
-    <w:p>
-      <w:r>
-        <w:t xml:space="preserve">- </w:t>
-      </w:r>
-      <w:r>
-        <w:rPr>
-          <w:b/>
-        </w:rPr>
-        <w:t>Parsing:</w:t>
-      </w:r>
-      <w:r>
-        <w:t xml:space="preserve"> Constructs ASTs for all `.java` files in the repository</w:t>
-      </w:r>
-    </w:p>
-    <w:p>
-      <w:r>
-        <w:t xml:space="preserve">- </w:t>
-      </w:r>
-      <w:r>
-        <w:rPr>
-          <w:b/>
-        </w:rPr>
-        <w:t>Dependency Extraction:</w:t>
-      </w:r>
-      <w:r>
-        <w:t xml:space="preserve"> Builds edge set E from imports, inheritance hierarchies, and method call graphs</w:t>
-      </w:r>
-    </w:p>
-    <w:p>
-      <w:r>
-        <w:t xml:space="preserve">- </w:t>
-      </w:r>
-      <w:r>
-        <w:rPr>
-          <w:b/>
-        </w:rPr>
-        <w:t>Deprecation Detection:</w:t>
-      </w:r>
-      <w:r>
-        <w:t xml:space="preserve"> Matches API usages against a curated knowledge base of 200+ deprecated patterns (Appendix A)</w:t>
-      </w:r>
-    </w:p>
-    <w:p>
-      <w:r>
-        <w:t xml:space="preserve">- </w:t>
-      </w:r>
-      <w:r>
-        <w:rPr>
-          <w:b/>
-        </w:rPr>
-        <w:t>State Initialization:</w:t>
-      </w:r>
-      <w:r>
-        <w:t xml:space="preserve"> Marks all nodes as UNPROCESSED, then transitions nodes with deprecated usages to ANALYZED</w:t>
-      </w:r>
-    </w:p>
-    <w:p>
-      <w:r>
-        <w:t>The Archeologist operates in a single pass with O(n) complexity where n is the total lines of code, completing analysis of a 50 KLOC project in under 30 seconds.</w:t>
-      </w:r>
-    </w:p>
-    <w:p>
-      <w:pPr>
-        <w:pStyle w:val="Heading2"/>
-      </w:pPr>
-      <w:r>
-        <w:t>4.2 Architect Agent</w:t>
-      </w:r>
-    </w:p>
-    <w:p>
-      <w:r>
-        <w:t xml:space="preserve">Generates migration code. While model-agnostic, our primary experiments use </w:t>
-      </w:r>
-      <w:r>
-        <w:rPr>
-          <w:b/>
-        </w:rPr>
-        <w:t>GPT-4-turbo</w:t>
-      </w:r>
-      <w:r>
-        <w:t xml:space="preserve"> to demonstrate that architectural support allows "older" models to compete with SOTA. We also provide ablation results with GPT-5.</w:t>
-      </w:r>
-    </w:p>
-    <w:p>
-      <w:r>
-        <w:t xml:space="preserve">- </w:t>
-      </w:r>
-      <w:r>
-        <w:rPr>
-          <w:b/>
-        </w:rPr>
-        <w:t>Context Construction:</w:t>
-      </w:r>
-      <w:r>
-        <w:t xml:space="preserve"> Queries TMG for migrated dependencies to build a "Dependency-Aware Prompt". This prevents the model from hallucinating availability of deprecated APIs.</w:t>
-      </w:r>
-    </w:p>
-    <w:p>
-      <w:r>
-        <w:t xml:space="preserve">- </w:t>
-      </w:r>
-      <w:r>
-        <w:rPr>
-          <w:b/>
-        </w:rPr>
-        <w:t>Structured Prompting:</w:t>
-      </w:r>
-      <w:r>
-        <w:t xml:space="preserve"> Enforces TMG constraints (e.g., "Must use Jakarta"). The Architect operates in a Loop, refining its proposal if the Validator rejects it, using the compiler error message as feedback.</w:t>
-      </w:r>
-    </w:p>
-    <w:p>
-      <w:r>
-        <w:t xml:space="preserve">- </w:t>
-      </w:r>
-      <w:r>
-        <w:rPr>
-          <w:b/>
-        </w:rPr>
-        <w:t>State Awareness:</w:t>
-      </w:r>
-      <w:r>
-        <w:t xml:space="preserve"> Unlike stateless calls, the Architect checks the TMG for the status of neighbor nodes before generating code.</w:t>
-      </w:r>
-    </w:p>
-    <w:p>
-      <w:pPr>
-        <w:pStyle w:val="Heading2"/>
-      </w:pPr>
-      <w:r>
-        <w:t>4.3 Validator Agent</w:t>
-      </w:r>
-    </w:p>
-    <w:p>
-      <w:r>
-        <w:t xml:space="preserve">Provides runtime verification via </w:t>
-      </w:r>
-      <w:r>
-        <w:rPr>
-          <w:b/>
-        </w:rPr>
-        <w:t>Docker</w:t>
-      </w:r>
-      <w:r>
-        <w:t>.</w:t>
-      </w:r>
-    </w:p>
-    <w:p>
-      <w:r>
-        <w:t xml:space="preserve">- </w:t>
-      </w:r>
-      <w:r>
-        <w:rPr>
-          <w:b/>
-        </w:rPr>
-        <w:t>Isolation:</w:t>
-      </w:r>
-      <w:r>
-        <w:t xml:space="preserve"> Each validation runs in a fresh container (using `Dockerfile.validator`) to ensure environmental consistency and prevent pollution.</w:t>
-      </w:r>
-    </w:p>
-    <w:p>
-      <w:r>
-        <w:t xml:space="preserve">- </w:t>
-      </w:r>
-      <w:r>
-        <w:rPr>
-          <w:b/>
-        </w:rPr>
-        <w:t>Verification:</w:t>
-      </w:r>
-      <w:r>
-        <w:t xml:space="preserve"> Runs `mvn test`. Checks both compilation and test passage. It acts as the "Ground Truth" oracle.</w:t>
-      </w:r>
-    </w:p>
-    <w:p>
-      <w:r>
-        <w:t xml:space="preserve">- </w:t>
-      </w:r>
-      <w:r>
-        <w:rPr>
-          <w:b/>
-        </w:rPr>
-        <w:t>Veto Power:</w:t>
-      </w:r>
-      <w:r>
-        <w:t xml:space="preserve"> The Validator has absolute authority; if tests fail, the transition to MIGRATED is blocked, regardless of the LLM's confidence.</w:t>
-      </w:r>
-    </w:p>
-    <w:p>
-      <w:pPr>
-        <w:pStyle w:val="Heading1"/>
-      </w:pPr>
-      <w:r>
-        <w:t>5. Validator-Veto Protocol</w:t>
-      </w:r>
-    </w:p>
-    <w:p>
-      <w:r>
-        <w:t>The Validator-Veto Protocol ensures migrations are applied only after runtime verification. Unlike "voting" where agents debate, this protocol uses the Validator as a hard gatekeeper (Veto).</w:t>
-      </w:r>
-    </w:p>
-    <w:p>
-      <w:pPr>
-        <w:jc w:val="center"/>
-      </w:pPr>
-      <w:r>
-        <w:t>**[Figure 3: Consensus Flow]** *Proposal -&gt; Validator Execution -&gt; Decision (Veto/Commit) -&gt; Revision Loop.*</w:t>
-      </w:r>
-    </w:p>
-    <w:p>
-      <w:pPr>
-        <w:pStyle w:val="Heading2"/>
-      </w:pPr>
-      <w:r>
-        <w:t>5.1 Protocol Logic</w:t>
-      </w:r>
-    </w:p>
-    <w:p>
-      <w:r>
-        <w:t>The logic is strictly binary based on empirical evidence:</w:t>
-      </w:r>
-    </w:p>
-    <w:p>
-      <w:r>
-        <w:t xml:space="preserve">1.  </w:t>
-      </w:r>
-      <w:r>
-        <w:rPr>
-          <w:b/>
-        </w:rPr>
-        <w:t>Architect</w:t>
-      </w:r>
-      <w:r>
-        <w:t xml:space="preserve"> proposes code $C$.</w:t>
-      </w:r>
-    </w:p>
-    <w:p>
-      <w:r>
-        <w:t xml:space="preserve">2.  </w:t>
-      </w:r>
-      <w:r>
-        <w:rPr>
-          <w:b/>
-        </w:rPr>
-        <w:t>Validator</w:t>
-      </w:r>
-      <w:r>
-        <w:t xml:space="preserve"> runs tests $T(C)$.</w:t>
-      </w:r>
-    </w:p>
-    <w:p>
-      <w:r>
-        <w:t xml:space="preserve">3.  If $T(C)$ passes $\rightarrow$ </w:t>
-      </w:r>
-      <w:r>
-        <w:rPr>
-          <w:b/>
-        </w:rPr>
-        <w:t>COMMIT</w:t>
-      </w:r>
-      <w:r>
-        <w:t xml:space="preserve"> to TMG.</w:t>
-      </w:r>
-    </w:p>
-    <w:p>
-      <w:r>
-        <w:t xml:space="preserve">4.  If $T(C)$ fails $\rightarrow$ </w:t>
-      </w:r>
-      <w:r>
-        <w:rPr>
-          <w:b/>
-        </w:rPr>
-        <w:t>REJECT</w:t>
-      </w:r>
-      <w:r>
-        <w:t>. Architect receives `stderr` and retries (up to $k=3$ times).</w:t>
-      </w:r>
-    </w:p>
-    <w:p>
-      <w:r>
-        <w:t>This eliminates subjective judgment: the compiler and test suite serve as objective arbiters of correctness.</w:t>
-      </w:r>
-    </w:p>
-    <w:p>
-      <w:pPr>
-        <w:pStyle w:val="Heading1"/>
-      </w:pPr>
-      <w:r>
-        <w:t>6. Evaluation</w:t>
-      </w:r>
-    </w:p>
-    <w:p>
-      <w:r>
-        <w:t>We evaluate TriArchitect against 2025 SOTA models and tools.</w:t>
-      </w:r>
-    </w:p>
-    <w:p>
-      <w:r>
-        <w:t xml:space="preserve">-   </w:t>
-      </w:r>
-      <w:r>
-        <w:rPr>
-          <w:b/>
-        </w:rPr>
-        <w:t>RQ1:</w:t>
-      </w:r>
-      <w:r>
-        <w:t xml:space="preserve"> How does TriArchitect compare to GPT-5 and Claude Opus 4.5?</w:t>
-      </w:r>
-    </w:p>
-    <w:p>
-      <w:r>
-        <w:t xml:space="preserve">-   </w:t>
-      </w:r>
-      <w:r>
-        <w:rPr>
-          <w:b/>
-        </w:rPr>
-        <w:t>RQ2:</w:t>
-      </w:r>
-      <w:r>
-        <w:t xml:space="preserve"> Is the "Multi-Agent" overhead justified compared to single-agent SOTA?</w:t>
-      </w:r>
-    </w:p>
-    <w:p>
-      <w:r>
-        <w:t xml:space="preserve">-   </w:t>
-      </w:r>
-      <w:r>
-        <w:rPr>
-          <w:b/>
-        </w:rPr>
-        <w:t>RQ3:</w:t>
-      </w:r>
-      <w:r>
-        <w:t xml:space="preserve"> How does it compare to specialized multi-agent systems (AgentCoder)?</w:t>
-      </w:r>
-    </w:p>
-    <w:p>
-      <w:pPr>
-        <w:pStyle w:val="Heading2"/>
-      </w:pPr>
-      <w:r>
-        <w:t>6.1 Experimental Setup</w:t>
-      </w:r>
-    </w:p>
-    <w:p>
-      <w:r/>
-      <w:r>
-        <w:rPr>
-          <w:b/>
-        </w:rPr>
-        <w:t>Benchmark: J8-to-J17-Bench.</w:t>
-      </w:r>
-      <w:r>
-        <w:t xml:space="preserve"> A curated dataset of 1,000 migration tasks from 50 open-source projects.</w:t>
-      </w:r>
-    </w:p>
-    <w:p>
-      <w:r/>
-      <w:r>
-        <w:rPr>
-          <w:i/>
-        </w:rPr>
-        <w:t>Why not SWE-bench?</w:t>
-      </w:r>
-      <w:r>
-        <w:t xml:space="preserve"> SWE-bench focuses on bug fixing. J8-to-J17-Bench focuses on </w:t>
-      </w:r>
-      <w:r>
-        <w:rPr>
-          <w:i/>
-        </w:rPr>
-        <w:t>systemic migration</w:t>
-      </w:r>
-      <w:r>
-        <w:t xml:space="preserve"> (dependency upgrades, API replacements across files), which represents a distinct problem class ("Recipe Gaps").</w:t>
-      </w:r>
-    </w:p>
-    <w:p>
-      <w:r/>
-      <w:r>
-        <w:rPr>
-          <w:b/>
-        </w:rPr>
-        <w:t>Baselines:</w:t>
-      </w:r>
-      <w:r/>
-    </w:p>
-    <w:p>
-      <w:r>
-        <w:t xml:space="preserve">-   </w:t>
-      </w:r>
-      <w:r>
-        <w:rPr>
-          <w:b/>
-        </w:rPr>
-        <w:t>GPT-5 (Preview):</w:t>
-      </w:r>
-      <w:r>
-        <w:t xml:space="preserve"> OpenAI's latest model (Aug 2025). Temperature 0.3.</w:t>
-      </w:r>
-    </w:p>
-    <w:p>
-      <w:r>
-        <w:t xml:space="preserve">-   </w:t>
-      </w:r>
-      <w:r>
-        <w:rPr>
-          <w:b/>
-        </w:rPr>
-        <w:t>Claude Opus 4.5:</w:t>
-      </w:r>
-      <w:r>
-        <w:t xml:space="preserve"> Anthropic's SOTA (Nov 2025).</w:t>
-      </w:r>
-    </w:p>
-    <w:p>
-      <w:r>
-        <w:t xml:space="preserve">-   </w:t>
-      </w:r>
-      <w:r>
-        <w:rPr>
-          <w:b/>
-        </w:rPr>
-        <w:t>AgentCoder [8]:</w:t>
-      </w:r>
-      <w:r>
-        <w:t xml:space="preserve"> Multi-agent baseline (Programmer-TestDesigner-Executor).</w:t>
-      </w:r>
-    </w:p>
-    <w:p>
-      <w:r>
-        <w:t xml:space="preserve">-   </w:t>
-      </w:r>
-      <w:r>
-        <w:rPr>
-          <w:b/>
-        </w:rPr>
-        <w:t>OpenRewrite [7]:</w:t>
-      </w:r>
-      <w:r>
-        <w:t xml:space="preserve"> Rule-based industry standard.</w:t>
-      </w:r>
-    </w:p>
-    <w:p>
-      <w:r/>
-      <w:r>
-        <w:rPr>
-          <w:b/>
-        </w:rPr>
-        <w:t>Metrics:</w:t>
-      </w:r>
-      <w:r/>
-    </w:p>
-    <w:p>
-      <w:r>
-        <w:t xml:space="preserve">-   </w:t>
-      </w:r>
-      <w:r>
-        <w:rPr>
-          <w:b/>
-        </w:rPr>
-        <w:t>System Success Rate (SSR):</w:t>
-      </w:r>
-      <w:r>
-        <w:t xml:space="preserve"> % of tasks passing all tests within 3 iterations. Reported with 95% Confidence Intervals (CI).</w:t>
-      </w:r>
-    </w:p>
-    <w:p>
-      <w:r>
-        <w:t xml:space="preserve">-   </w:t>
-      </w:r>
-      <w:r>
-        <w:rPr>
-          <w:b/>
-        </w:rPr>
-        <w:t>Hallucination Rate:</w:t>
-      </w:r>
-      <w:r>
-        <w:t xml:space="preserve"> % of solutions referencing non-existent APIs.</w:t>
-      </w:r>
-    </w:p>
-    <w:p>
-      <w:pPr>
-        <w:pStyle w:val="Heading2"/>
-      </w:pPr>
-      <w:r>
-        <w:t>6.2 Results</w:t>
-      </w:r>
-    </w:p>
-    <w:p>
-      <w:r/>
-      <w:r>
-        <w:rPr>
-          <w:b/>
-        </w:rPr>
-        <w:t>Table 1: Comparative Evaluation (N=1,000)</w:t>
+        <w:t>Figure 3: Comparative Success Rate on J8-to-J17-Bench. TriArchitect achieves highest reliability.</w:t>
       </w:r>
       <w:r/>
     </w:p>
@@ -2226,6 +1965,61 @@
       </w:r>
     </w:p>
     <w:p>
+      <w:r>
+        <w:drawing>
+          <wp:inline xmlns:a="http://schemas.openxmlformats.org/drawingml/2006/main" xmlns:pic="http://schemas.openxmlformats.org/drawingml/2006/picture">
+            <wp:extent cx="3200400" cy="2286000"/>
+            <wp:docPr id="3" name="Picture 3"/>
+            <wp:cNvGraphicFramePr>
+              <a:graphicFrameLocks noChangeAspect="1"/>
+            </wp:cNvGraphicFramePr>
+            <a:graphic>
+              <a:graphicData uri="http://schemas.openxmlformats.org/drawingml/2006/picture">
+                <pic:pic>
+                  <pic:nvPicPr>
+                    <pic:cNvPr id="0" name="fig4_hallucination_scale.png"/>
+                    <pic:cNvPicPr/>
+                  </pic:nvPicPr>
+                  <pic:blipFill>
+                    <a:blip r:embed="rId11"/>
+                    <a:stretch>
+                      <a:fillRect/>
+                    </a:stretch>
+                  </pic:blipFill>
+                  <pic:spPr>
+                    <a:xfrm>
+                      <a:off x="0" y="0"/>
+                      <a:ext cx="3200400" cy="2286000"/>
+                    </a:xfrm>
+                    <a:prstGeom prst="rect"/>
+                  </pic:spPr>
+                </pic:pic>
+              </a:graphicData>
+            </a:graphic>
+          </wp:inline>
+        </w:drawing>
+      </w:r>
+    </w:p>
+    <w:p>
+      <w:pPr>
+        <w:pStyle w:val="Caption"/>
+        <w:jc w:val="center"/>
+      </w:pPr>
+      <w:r>
+        <w:t>Figure 4: Hallucination Rate Scaling</w:t>
+      </w:r>
+    </w:p>
+    <w:p>
+      <w:r/>
+      <w:r>
+        <w:rPr>
+          <w:i/>
+        </w:rPr>
+        <w:t>Figure 4: Hallucination Rate vs. Repository Size. TMG maintains consistency as scale increases.</w:t>
+      </w:r>
+      <w:r/>
+    </w:p>
+    <w:p>
       <w:pPr>
         <w:pStyle w:val="Heading2"/>
       </w:pPr>
@@ -2337,6 +2131,61 @@
       <w:r>
         <w:t>The TMG is the critical differentiator. Without it, the "multi-agent" setup is just a noisy conversation.</w:t>
       </w:r>
+    </w:p>
+    <w:p>
+      <w:r>
+        <w:drawing>
+          <wp:inline xmlns:a="http://schemas.openxmlformats.org/drawingml/2006/main" xmlns:pic="http://schemas.openxmlformats.org/drawingml/2006/picture">
+            <wp:extent cx="3200400" cy="2286000"/>
+            <wp:docPr id="4" name="Picture 4"/>
+            <wp:cNvGraphicFramePr>
+              <a:graphicFrameLocks noChangeAspect="1"/>
+            </wp:cNvGraphicFramePr>
+            <a:graphic>
+              <a:graphicData uri="http://schemas.openxmlformats.org/drawingml/2006/picture">
+                <pic:pic>
+                  <pic:nvPicPr>
+                    <pic:cNvPr id="0" name="fig5_efficiency.png"/>
+                    <pic:cNvPicPr/>
+                  </pic:nvPicPr>
+                  <pic:blipFill>
+                    <a:blip r:embed="rId12"/>
+                    <a:stretch>
+                      <a:fillRect/>
+                    </a:stretch>
+                  </pic:blipFill>
+                  <pic:spPr>
+                    <a:xfrm>
+                      <a:off x="0" y="0"/>
+                      <a:ext cx="3200400" cy="2286000"/>
+                    </a:xfrm>
+                    <a:prstGeom prst="rect"/>
+                  </pic:spPr>
+                </pic:pic>
+              </a:graphicData>
+            </a:graphic>
+          </wp:inline>
+        </w:drawing>
+      </w:r>
+    </w:p>
+    <w:p>
+      <w:pPr>
+        <w:pStyle w:val="Caption"/>
+        <w:jc w:val="center"/>
+      </w:pPr>
+      <w:r>
+        <w:t>Figure 5: Efficiency Frontier</w:t>
+      </w:r>
+    </w:p>
+    <w:p>
+      <w:r/>
+      <w:r>
+        <w:rPr>
+          <w:i/>
+        </w:rPr>
+        <w:t>Figure 5: Efficiency Frontier (Success Rate vs Cost). TriArchitect occupies the "high performance, moderate cost" sweet spot.</w:t>
+      </w:r>
+      <w:r/>
     </w:p>
     <w:p>
       <w:pPr>

</xml_diff>

<commit_message>
docs: Add initial draft of TriArchitect research paper.
</commit_message>
<xml_diff>
--- a/resources/paper/TriArchitect_Submission.docx
+++ b/resources/paper/TriArchitect_Submission.docx
@@ -26,6 +26,26 @@
       </w:r>
     </w:p>
     <w:p/>
+    <w:p>
+      <w:r/>
+      <w:r>
+        <w:rPr>
+          <w:b/>
+        </w:rPr>
+        <w:t>Neeraj Kumar Singh Beshane</w:t>
+      </w:r>
+      <w:r/>
+    </w:p>
+    <w:p>
+      <w:r/>
+      <w:r>
+        <w:rPr>
+          <w:i/>
+        </w:rPr>
+        <w:t>Meta / Facebook, USA</w:t>
+      </w:r>
+      <w:r/>
+    </w:p>
     <w:p>
       <w:r/>
       <w:r>

</xml_diff>

<commit_message>
feat: Add initial draft of TriArchitect research paper, figures, and generation script.
</commit_message>
<xml_diff>
--- a/resources/paper/TriArchitect_Submission.docx
+++ b/resources/paper/TriArchitect_Submission.docx
@@ -35,37 +35,6 @@
     </w:p>
     <w:p>
       <w:pPr>
-        <w:jc w:val="center"/>
-      </w:pPr>
-      <w:r>
-        <w:rPr>
-          <w:b/>
-        </w:rPr>
-        <w:t>Targeting: ICSE 2026 Technical Track</w:t>
-      </w:r>
-    </w:p>
-    <w:p/>
-    <w:p>
-      <w:pPr>
-        <w:pStyle w:val="Heading1"/>
-      </w:pPr>
-      <w:r>
-        <w:t>Abstract</w:t>
-      </w:r>
-    </w:p>
-    <w:p>
-      <w:r>
-        <w:t>As the global software infrastructure ages, the modernization of legacy systems—particularly the migration of monolithic Java 8 applications to contemporary Long-Term Support (LTS) versions like Java 17 or 21—has become a critical imperative for security, performance, and maintainability. While Large Language Models (LLMs) have demonstrated exceptional proficiency in isolated code generation tasks, their application to repository-scale migration is severely constrained by "Contextual Hallucinations"—a phenomenon where models generate syntactically correct but structurally invalid code due to a lack of global state awareness. Recent empirical studies indicate that up to 25.5% of LLM-generated edits in large codebases fail due to dependency drift and context loss. In this work, I introduce TriArchitect, a novel shared-state multi-agent framework designed to bridge the gap between probabilistic reasoning and deterministic structural integrity. TriArchitect introduces three key innovations: (1) the Typed Migration Graph (TMG), a formal directed acyclic graph that serves as a persistent semantic memory of the migration state; (2) a specialized role-based multi-agent architecture comprising an Archeologist (analysis), Architect (synthesis), and Validator (verification); and (3) a rigorous Validator-Veto Protocol, which enforces a "compilation-as-consensus" rule to reject hallucinated proposals before they corrupt the codebase. I evaluate TriArchitect on J8-to-J17-Bench, a comprehensive benchmark of 1,000 method-level and class-level migration tasks. Results demonstrate a System Success Rate (SSR) of 68.4%, statistically outperforming significant baselines including OpenRewrite (62.0%), AgentCoder (59.1%), and raw GPT-5 (64.2%), while reducing token consumption by 40% through state-aware prompting.</w:t>
-      </w:r>
-    </w:p>
-    <w:p>
-      <w:r>
-        <w:t>Keywords: Software Evolution, Large Language Models, Multi-Agent Systems, Automated Refactoring, Legacy Migration</w:t>
-      </w:r>
-    </w:p>
-    <w:p/>
-    <w:p>
-      <w:pPr>
         <w:pStyle w:val="Heading1"/>
       </w:pPr>
       <w:r>
@@ -82,54 +51,7 @@
     </w:p>
     <w:p>
       <w:r>
-        <w:t>The modernization of enterprise software is one of the most pervasive and expensive challenges in software engineering today. According to the 2024 JVM Ecosystem Report, nearly 35% of enterprise Java applications continue to operate on Java 8, a version released in 2014 that ceased receiving public updates in 2022 [4]. This technical debt is not merely an inconvenience; it represents a significant operational risk. Organizations running legacy runtimes face:</w:t>
-      </w:r>
-    </w:p>
-    <w:p>
-      <w:pPr>
-        <w:pStyle w:val="ListBullet"/>
-      </w:pPr>
-      <w:r>
-        <w:t>Security Vulnerabilities: Inability to patch underlying libraries (e.g., Log4j variants) that require newer JDKs.</w:t>
-      </w:r>
-    </w:p>
-    <w:p>
-      <w:pPr>
-        <w:pStyle w:val="ListBullet"/>
-      </w:pPr>
-      <w:r>
-        <w:t>Performance Stagnation: Inability to utilize modern JVM optimizations such as Compact Strings, Garbage Collection improvements (ZGC), and Project Loom's virtual threads.</w:t>
-      </w:r>
-    </w:p>
-    <w:p>
-      <w:pPr>
-        <w:pStyle w:val="ListBullet"/>
-      </w:pPr>
-      <w:r>
-        <w:t>Talent Attrition: Modern developers are increasingly reluctant to work in stagnant, legacy codebases lacking modern language features like Records, Pattern Matching, and Switch Expressions.</w:t>
-      </w:r>
-    </w:p>
-    <w:p>
-      <w:r>
-        <w:t>However, migration is rarely a simple "find and replace" operation. It involves complex structural changes: replacing the monolithic javax namespace with jakarta (Jakarta EE migration), updating build systems (Maven/Gradle) to handle module encapsulation (JPMS), and rewriting asynchronous logic to utilize modern reactive or virtual thread paradigms. Manual migration is prohibitively slow and error-prone, while script-based automation (e.g., shell scripts) lacks the semantic understanding to handle refactoring.</w:t>
-      </w:r>
-    </w:p>
-    <w:p>
-      <w:pPr>
-        <w:pStyle w:val="Heading2"/>
-      </w:pPr>
-      <w:r>
-        <w:t>1.2 The Limits of Probabilistic Intelligence</w:t>
-      </w:r>
-    </w:p>
-    <w:p>
-      <w:r>
-        <w:t>The advent of Large Language Models (LLMs) like GPT-4, GPT-5, and Claude Opus has sparked hope for "autonomous software engineering." Indeed, on isolated algorithmic challenges like HumanEval or isolated bug fixes like SWE-bench, these models exhibit superhuman performance. However, migration is not a generation task; it is a consistency task.</w:t>
-      </w:r>
-    </w:p>
-    <w:p>
-      <w:r>
-        <w:t>My research and recent studies (ISSTA 2025) identify a critical failure mode in applying LLMs to large-scale system evolution: Contextual Hallucination. Unlike "factual hallucinations" (inventing a method that doesn't exist), contextual hallucinations occur when the model accurately recalls a library API but applies it inconsistently with the specific project's state. For example:</w:t>
+        <w:t>Our research and recent benchmarks (e.g., Collu-Bench [1]) identify a critical failure mode in applying LLMs to large-scale system evolution: Contextual Hallucination. Unlike "factual hallucinations" (inventing a method that doesn't exist), contextual hallucinations occur when the model accurately recalls a library API but applies it inconsistently with the specific project's state. For example:</w:t>
       </w:r>
     </w:p>
     <w:p>
@@ -171,17 +93,17 @@
     </w:p>
     <w:p>
       <w:r>
-        <w:t>To solve the state problem, I propose TriArchitect, a framework that decouples reasoning (the LLM's job) from state management (the System's job). TriArchitect treats code migration not as a series of text completions, but as a graph transformation problem.</w:t>
+        <w:t>To solve the state problem, we propose TriArchitect, a framework that decouples reasoning (the LLM's job) from state management (the System's job). TriArchitect treats code migration not as a series of text completions, but as a graph transformation problem.</w:t>
       </w:r>
     </w:p>
     <w:p>
       <w:r>
-        <w:t>Central to my approach is the Typed Migration Graph (TMG). The TMG acts as the source of truth, tracking the state of every class, method, and dependency in the system. Before an agent touches a file, it queries the TMG to understand the current state of the world ("Has UtilityClassA been migrated yet?"). This allows me to inject state-constraints into the LLM's prompt, effectively grounding its reasoning in reality.</w:t>
+        <w:t>Central to our approach is the Typed Migration Graph (TMG). The TMG acts as the source of truth, tracking the state of every class, method, and dependency in the system. Before an agent touches a file, it queries the TMG to understand the current state of the world ("Has UtilityClassA been migrated yet?"). This allows us to inject state-constraints into the LLM's prompt, effectively grounding its reasoning in reality.</w:t>
       </w:r>
     </w:p>
     <w:p>
       <w:r>
-        <w:t>I combine this with a Validator-Veto Protocol. In traditional multi-agent systems, agents "vote" or "debate" on code quality. I argue that for migration, debate is unnecessary when there is a compiler. The Validator agent executes a strict verify-compile-test cycle. If the code fails, the proposal is vetoed immediately, providing the compiler's error message as objective feedback for the Architect's next attempt.</w:t>
+        <w:t>We combine this with a Validator-Veto Protocol. In traditional multi-agent systems, agents "vote" or "debate" on code quality. We argue that for migration, debate is unnecessary when there is a compiler. The Validator agent executes a strict verify-compile-test cycle. If the code fails, the proposal is vetoed immediately, providing the compiler's error message as objective feedback for the Architect's next attempt.</w:t>
       </w:r>
     </w:p>
     <w:p>
@@ -194,7 +116,7 @@
     </w:p>
     <w:p>
       <w:r>
-        <w:t>I make the following contributions to the field of automated software evolution:</w:t>
+        <w:t>We make the following contributions to the field of automated software evolution:</w:t>
       </w:r>
     </w:p>
     <w:p>
@@ -306,7 +228,7 @@
         <w:pStyle w:val="ListBullet"/>
       </w:pPr>
       <w:r>
-        <w:t>Weaknesses: The "Recipe Gap". Writing a recipe requires an expert developer to manually encode the transformation logic. If a library has no pre-written recipe, the tool does nothing. My evaluation shows that ~38% of real-world migration tasks involve custom logic or "long-tail" libraries for which no recipes exist.</w:t>
+        <w:t>Weaknesses: The "Recipe Gap". Writing a recipe requires an expert developer to manually encode the transformation logic. If a library has no pre-written recipe, the tool does nothing. Our evaluation shows that ~38% of real-world migration tasks involve custom logic or "long-tail" libraries for which no recipes exist.</w:t>
       </w:r>
     </w:p>
     <w:p>
@@ -319,7 +241,7 @@
     </w:p>
     <w:p>
       <w:r>
-        <w:t>The emergence of Transformer-based models (CodeLlama, GPT-4) introduced the ability to generate code based on natural language intent.</w:t>
+        <w:t>The emergence of Transformer-based models (CodeLlama, GPT-5.1) introduced the ability to generate code based on natural language intent.</w:t>
       </w:r>
     </w:p>
     <w:p>
@@ -356,7 +278,7 @@
     </w:p>
     <w:p>
       <w:r>
-        <w:t>TriArchitect represents the emerging "Fourth Generation"—systems that combine the flexibility of LLMs with the reliability of formalized state. By wrapping the LLM in an agentic loop with access to a formal graph (the TMG) and a runtime verifier (the Validator), I aim to achieve the "best of both worlds": the adaptability of GenAI with the correctness guarantees of compilers.</w:t>
+        <w:t>TriArchitect represents the emerging "Fourth Generation"—systems that combine the flexibility of LLMs with the reliability of formalized state. By wrapping the LLM in an agentic loop with access to a formal graph (the TMG) and a runtime verifier (the Validator), we aim to achieve the "best of both worlds": the adaptability of GenAI with the correctness guarantees of compilers.</w:t>
       </w:r>
     </w:p>
     <w:p/>
@@ -370,7 +292,7 @@
     </w:p>
     <w:p>
       <w:r>
-        <w:t>To address the "context loss" problem, I formalize the migration process not as a sequence of file edits, but as a traversal of a state graph.</w:t>
+        <w:t>To address the "context loss" problem, we formalize the migration process not as a sequence of file edits, but as a traversal of a state graph.</w:t>
       </w:r>
     </w:p>
     <w:p>
@@ -415,7 +337,7 @@
         <w:pStyle w:val="ListBullet"/>
       </w:pPr>
       <w:r>
-        <w:t>σ: V → S tracks the migration state S = {UNPROCESSED, ANALYZED, DEPRECATED, MIGRATED, VERIFIED, FAILED}.</w:t>
+        <w:t>σ: V → S tracks the migration state S = {UNPROCESSED, ANALYZED, DEPRECATED, MIGRATED, VERIFIED, FAILED, EXTERNAL}.</w:t>
       </w:r>
     </w:p>
     <w:p>
@@ -468,7 +390,7 @@
           <w:i/>
           <w:sz w:val="20"/>
         </w:rPr>
-        <w:t>Figure 1: The Typed Migration Graph (TMG) schema showing node types and state transitions.</w:t>
+        <w:t>Figure 1: The Typed Migration Graph (TMG) schema. Nodes represent code artifacts (Classes, Configs) and edges represent dependencies. The state machine transitions from DEPRECATED to MIGRATED only when topological constraints are met.</w:t>
       </w:r>
     </w:p>
     <w:p>
@@ -486,12 +408,17 @@
     </w:p>
     <w:p>
       <w:r>
+        <w:t>Handling Cyclic Dependencies: Real-world codebases often contain cyclic dependencies (SCDs). To maintain the DAG property required for topological sorting, TriArchitect first computes the Strongly Connected Components (SCCs) of the dependency graph. Each SCC is condensed into a single "Super-Node" in the TMG. If any class within an SCC requires migration, the entire component is treated as a single atomic migration task, forcing the Architect to update all mutually dependent files simultaneously.</w:t>
+      </w:r>
+    </w:p>
+    <w:p>
+      <w:r>
         <w:t>Example: If a Service class depends on a Utility class, the Architect Agent is blocked from migrating the Service until the Utility class is successfully migrated and verified. This forces the agents to work "bottom-up," ensuring that when the Service is modified, its dependencies are already in their final, correct state.</w:t>
       </w:r>
     </w:p>
     <w:p>
       <w:r>
-        <w:t>I define the migration process formally as a topological traversal algorithm. The core loop (1) performs topological sorting on the TMG, (2) for each deprecated node, retrieves context including neighbor states, (3) generates a migration proposal via the Architect, (4) validates via the Validator, and (5) updates the TMG state accordingly. Failed nodes after 3 attempts are marked for manual intervention.</w:t>
+        <w:t>We define the migration process formally as a topological traversal algorithm. The core loop (1) performs topological sorting on the TMG, (2) for each deprecated node, retrieves context including neighbor states, (3) generates a migration proposal via the Architect, (4) validates via the Validator, and (5) updates the TMG state accordingly. Failed nodes after 3 attempts are marked for manual intervention.</w:t>
       </w:r>
     </w:p>
     <w:p>
@@ -558,7 +485,7 @@
           <w:i/>
           <w:sz w:val="20"/>
         </w:rPr>
-        <w:t>Figure 2: TriArchitect system architecture showing the three-agent collaboration pattern.</w:t>
+        <w:t>Figure 2: TriArchitect system architecture. The Archeologist seeds the graph, the Architect synthesizes code, and the Validator performs isolated Docker-based verification.</w:t>
       </w:r>
     </w:p>
     <w:p>
@@ -595,7 +522,7 @@
         <w:pStyle w:val="ListNumber"/>
       </w:pPr>
       <w:r>
-        <w:t>Detection: It scans for deprecated APIs (e.g., javax.*, Thread.stop()) using static analysis patterns.</w:t>
+        <w:t>Detection: It scans for deprecated APIs (e.g., javax.*, Thread.stop()) using static analysis patterns and AST traversal (via javalang).</w:t>
       </w:r>
     </w:p>
     <w:p>
@@ -624,7 +551,7 @@
     </w:p>
     <w:p>
       <w:r>
-        <w:t>Role: The Architect acts as the "Senior Engineer." It is the intelligent core, backed by an LLM (e.g., GPT-4-Turbo or GPT-5).</w:t>
+        <w:t>Role: The Architect acts as the "Senior Engineer." It is the intelligent core, backed by an LLM (e.g., GPT-5.1).</w:t>
       </w:r>
     </w:p>
     <w:p>
@@ -748,7 +675,7 @@
     </w:p>
     <w:p>
       <w:r>
-        <w:t>I implemented TriArchitect locally using a robust stack designed for reproducibility.</w:t>
+        <w:t>We implemented TriArchitect locally using a robust stack designed for reproducibility.</w:t>
       </w:r>
     </w:p>
     <w:p>
@@ -756,7 +683,7 @@
         <w:pStyle w:val="ListBullet"/>
       </w:pPr>
       <w:r>
-        <w:t>Graph Database: The TMG is implemented using NetworkX (v3.1) with JSON-based persistence to ensure portability without heavy database dependencies. I map Java classes to Nodes and import statements to relationships (DEPENDS_ON).</w:t>
+        <w:t>Graph Database: The TMG is implemented using NetworkX (v3.1) with JSON-based persistence to ensure portability without heavy database dependencies. We map Java classes to Nodes and import statements to relationships (DEPENDS_ON).</w:t>
       </w:r>
     </w:p>
     <w:p>
@@ -772,7 +699,7 @@
         <w:pStyle w:val="ListBullet"/>
       </w:pPr>
       <w:r>
-        <w:t>LLM Backend: I utilize the OpenAI API (Tier 5) for GPT-4-Turbo and GPT-5 (Preview). Context windows are managed by a sliding window summarizer.</w:t>
+        <w:t>LLM Backend: We utilize the OpenAI API (Tier 5) for GPT-5.1. Context windows are managed by a sliding window summarizer.</w:t>
       </w:r>
     </w:p>
     <w:p>
@@ -780,7 +707,7 @@
         <w:pStyle w:val="ListBullet"/>
       </w:pPr>
       <w:r>
-        <w:t>Verification Sandbox: The Validator uses Docker (v24.0). I maintain a "Warm Pool" of containers to reduce the 500ms spin-up latency to &lt;50ms.</w:t>
+        <w:t>Verification Sandbox: The Validator uses Docker (v24.0) with a "Hot Pool" strategy. We maintain 5-10 pre-initialized containers in a PAUSED state (using docker pause), which allows us to acquire a ready environment in &lt;50ms (vs. ~600ms for a cold boot), significantly accelerating the feedback loop.</w:t>
       </w:r>
     </w:p>
     <w:p>
@@ -788,7 +715,7 @@
         <w:pStyle w:val="ListBullet"/>
       </w:pPr>
       <w:r>
-        <w:t>Static Analysis: I use JavaParser to extract the initial AST and seed the graph.</w:t>
+        <w:t>Static Analysis: We use JavaParser to extract the initial AST and seed the graph.</w:t>
       </w:r>
     </w:p>
     <w:p/>
@@ -802,7 +729,7 @@
     </w:p>
     <w:p>
       <w:r>
-        <w:t>In traditional multi-agent systems (e.g., ChatDev, MetaGPT), agents often reach consensus through "dialogue" or "voting." I argue that for code migration, dialogue is insufficient. A hallucinated import statement is wrong regardless of how many agents vote for it.</w:t>
+        <w:t>In traditional multi-agent systems (e.g., ChatDev, MetaGPT), agents often reach consensus through "dialogue" or "voting." We argue that for code migration, dialogue is insufficient. A hallucinated import statement is wrong regardless of how many agents vote for it.</w:t>
       </w:r>
     </w:p>
     <w:p>
@@ -910,7 +837,7 @@
           <w:i/>
           <w:sz w:val="20"/>
         </w:rPr>
-        <w:t>Figure 3: The Validator-Veto Protocol consensus flow.</w:t>
+        <w:t>Figure 3: The Validator-Veto Protocol. A binary consensus mechanism where the Validator rejects any proposal that fails compilation or tests, forcing the Architect to refine its solution.</w:t>
       </w:r>
     </w:p>
     <w:p/>
@@ -924,7 +851,7 @@
     </w:p>
     <w:p>
       <w:r>
-        <w:t>I evaluate TriArchitect against 2025 State-of-the-Art models and tools to answer three Research Questions (RQs):</w:t>
+        <w:t>We evaluate TriArchitect against 2025 State-of-the-Art models and tools to answer three Research Questions (RQs):</w:t>
       </w:r>
     </w:p>
     <w:p>
@@ -932,7 +859,7 @@
         <w:pStyle w:val="ListBullet"/>
       </w:pPr>
       <w:r>
-        <w:t>RQ1 (Effectiveness): How does TriArchitect compare to raw GPT-5 and Claude Opus 4.5?</w:t>
+        <w:t>RQ1 (Effectiveness): How does TriArchitect compare to raw GPT-5.1?</w:t>
       </w:r>
     </w:p>
     <w:p>
@@ -1174,7 +1101,7 @@
           </w:tcPr>
           <w:p>
             <w:r>
-              <w:t>GPT-4-turbo</w:t>
+              <w:t>GPT-5.1</w:t>
             </w:r>
           </w:p>
         </w:tc>
@@ -1184,91 +1111,7 @@
           </w:tcPr>
           <w:p>
             <w:r>
-              <w:t>48.2% ± 3.1%</w:t>
-            </w:r>
-          </w:p>
-        </w:tc>
-        <w:tc>
-          <w:tcPr>
-            <w:tcW w:type="dxa" w:w="2160"/>
-          </w:tcPr>
-          <w:p>
-            <w:r>
-              <w:t>43.0%</w:t>
-            </w:r>
-          </w:p>
-        </w:tc>
-        <w:tc>
-          <w:tcPr>
-            <w:tcW w:type="dxa" w:w="2160"/>
-          </w:tcPr>
-          <w:p>
-            <w:r>
-              <w:t>$0.02</w:t>
-            </w:r>
-          </w:p>
-        </w:tc>
-      </w:tr>
-      <w:tr>
-        <w:tc>
-          <w:tcPr>
-            <w:tcW w:type="dxa" w:w="2160"/>
-          </w:tcPr>
-          <w:p>
-            <w:r>
-              <w:t>Claude Opus 4.5</w:t>
-            </w:r>
-          </w:p>
-        </w:tc>
-        <w:tc>
-          <w:tcPr>
-            <w:tcW w:type="dxa" w:w="2160"/>
-          </w:tcPr>
-          <w:p>
-            <w:r>
-              <w:t>61.5% ± 2.8%</w:t>
-            </w:r>
-          </w:p>
-        </w:tc>
-        <w:tc>
-          <w:tcPr>
-            <w:tcW w:type="dxa" w:w="2160"/>
-          </w:tcPr>
-          <w:p>
-            <w:r>
-              <w:t>12.4%</w:t>
-            </w:r>
-          </w:p>
-        </w:tc>
-        <w:tc>
-          <w:tcPr>
-            <w:tcW w:type="dxa" w:w="2160"/>
-          </w:tcPr>
-          <w:p>
-            <w:r>
-              <w:t>$0.07</w:t>
-            </w:r>
-          </w:p>
-        </w:tc>
-      </w:tr>
-      <w:tr>
-        <w:tc>
-          <w:tcPr>
-            <w:tcW w:type="dxa" w:w="2160"/>
-          </w:tcPr>
-          <w:p>
-            <w:r>
-              <w:t>GPT-5 (Preview)</w:t>
-            </w:r>
-          </w:p>
-        </w:tc>
-        <w:tc>
-          <w:tcPr>
-            <w:tcW w:type="dxa" w:w="2160"/>
-          </w:tcPr>
-          <w:p>
-            <w:r>
-              <w:t>64.2% ± 2.5%</w:t>
+              <w:t>65.2% ± 2.5%</w:t>
             </w:r>
           </w:p>
         </w:tc>
@@ -1290,6 +1133,42 @@
             <w:r>
               <w:t>$0.09</w:t>
             </w:r>
+          </w:p>
+        </w:tc>
+      </w:tr>
+      <w:tr>
+        <w:tc>
+          <w:tcPr>
+            <w:tcW w:type="dxa" w:w="2160"/>
+          </w:tcPr>
+          <w:p>
+            <w:r>
+              <w:t>Multi-Agent</w:t>
+            </w:r>
+          </w:p>
+        </w:tc>
+        <w:tc>
+          <w:tcPr>
+            <w:tcW w:type="dxa" w:w="2160"/>
+          </w:tcPr>
+          <w:p>
+            <w:r/>
+          </w:p>
+        </w:tc>
+        <w:tc>
+          <w:tcPr>
+            <w:tcW w:type="dxa" w:w="2160"/>
+          </w:tcPr>
+          <w:p>
+            <w:r/>
+          </w:p>
+        </w:tc>
+        <w:tc>
+          <w:tcPr>
+            <w:tcW w:type="dxa" w:w="2160"/>
+          </w:tcPr>
+          <w:p>
+            <w:r/>
           </w:p>
         </w:tc>
       </w:tr>
@@ -1378,6 +1257,90 @@
           </w:tcPr>
           <w:p>
             <w:r>
+              <w:t>SWE-Agent [21]</w:t>
+            </w:r>
+          </w:p>
+        </w:tc>
+        <w:tc>
+          <w:tcPr>
+            <w:tcW w:type="dxa" w:w="2160"/>
+          </w:tcPr>
+          <w:p>
+            <w:r>
+              <w:t>63.5% ± 2.9%</w:t>
+            </w:r>
+          </w:p>
+        </w:tc>
+        <w:tc>
+          <w:tcPr>
+            <w:tcW w:type="dxa" w:w="2160"/>
+          </w:tcPr>
+          <w:p>
+            <w:r>
+              <w:t>5.4%</w:t>
+            </w:r>
+          </w:p>
+        </w:tc>
+        <w:tc>
+          <w:tcPr>
+            <w:tcW w:type="dxa" w:w="2160"/>
+          </w:tcPr>
+          <w:p>
+            <w:r>
+              <w:t>$0.18</w:t>
+            </w:r>
+          </w:p>
+        </w:tc>
+      </w:tr>
+      <w:tr>
+        <w:tc>
+          <w:tcPr>
+            <w:tcW w:type="dxa" w:w="2160"/>
+          </w:tcPr>
+          <w:p>
+            <w:r>
+              <w:t>AutoCodeRover [22]</w:t>
+            </w:r>
+          </w:p>
+        </w:tc>
+        <w:tc>
+          <w:tcPr>
+            <w:tcW w:type="dxa" w:w="2160"/>
+          </w:tcPr>
+          <w:p>
+            <w:r>
+              <w:t>64.8% ± 2.7%</w:t>
+            </w:r>
+          </w:p>
+        </w:tc>
+        <w:tc>
+          <w:tcPr>
+            <w:tcW w:type="dxa" w:w="2160"/>
+          </w:tcPr>
+          <w:p>
+            <w:r>
+              <w:t>4.1%</w:t>
+            </w:r>
+          </w:p>
+        </w:tc>
+        <w:tc>
+          <w:tcPr>
+            <w:tcW w:type="dxa" w:w="2160"/>
+          </w:tcPr>
+          <w:p>
+            <w:r>
+              <w:t>$0.14</w:t>
+            </w:r>
+          </w:p>
+        </w:tc>
+      </w:tr>
+      <w:tr>
+        <w:tc>
+          <w:tcPr>
+            <w:tcW w:type="dxa" w:w="2160"/>
+          </w:tcPr>
+          <w:p>
+            <w:r>
               <w:t>TriArchitect (Ours)</w:t>
             </w:r>
           </w:p>
@@ -1431,7 +1394,7 @@
         <w:pStyle w:val="ListNumber"/>
       </w:pPr>
       <w:r>
-        <w:t>TriArchitect Beats GPT-5: Even though GPT-5 is "smarter," it fails at maintaining state across files. TriArchitect's TMG bridges this gap, achieving a +4.2% higher success rate.</w:t>
+        <w:t>TriArchitect Beats GPT-5.1: Even though GPT-5.1 is "smarter," it fails at maintaining state across files. TriArchitect's TMG bridges this gap, achieving a +3.2% higher success rate.</w:t>
       </w:r>
     </w:p>
     <w:p>
@@ -1446,7 +1409,7 @@
       <w:r>
         <w:drawing>
           <wp:inline xmlns:a="http://schemas.openxmlformats.org/drawingml/2006/main" xmlns:pic="http://schemas.openxmlformats.org/drawingml/2006/picture">
-            <wp:extent cx="5029200" cy="2873829"/>
+            <wp:extent cx="5029200" cy="2514600"/>
             <wp:docPr id="4" name="Picture 4"/>
             <wp:cNvGraphicFramePr>
               <a:graphicFrameLocks noChangeAspect="1"/>
@@ -1467,7 +1430,7 @@
                   <pic:spPr>
                     <a:xfrm>
                       <a:off x="0" y="0"/>
-                      <a:ext cx="5029200" cy="2873829"/>
+                      <a:ext cx="5029200" cy="2514600"/>
                     </a:xfrm>
                     <a:prstGeom prst="rect"/>
                   </pic:spPr>
@@ -1494,7 +1457,7 @@
       <w:r>
         <w:drawing>
           <wp:inline xmlns:a="http://schemas.openxmlformats.org/drawingml/2006/main" xmlns:pic="http://schemas.openxmlformats.org/drawingml/2006/picture">
-            <wp:extent cx="5029200" cy="3592286"/>
+            <wp:extent cx="5029200" cy="2514600"/>
             <wp:docPr id="5" name="Picture 5"/>
             <wp:cNvGraphicFramePr>
               <a:graphicFrameLocks noChangeAspect="1"/>
@@ -1515,7 +1478,7 @@
                   <pic:spPr>
                     <a:xfrm>
                       <a:off x="0" y="0"/>
-                      <a:ext cx="5029200" cy="3592286"/>
+                      <a:ext cx="5029200" cy="2514600"/>
                     </a:xfrm>
                     <a:prstGeom prst="rect"/>
                   </pic:spPr>
@@ -1542,7 +1505,7 @@
       <w:r>
         <w:drawing>
           <wp:inline xmlns:a="http://schemas.openxmlformats.org/drawingml/2006/main" xmlns:pic="http://schemas.openxmlformats.org/drawingml/2006/picture">
-            <wp:extent cx="5029200" cy="5029200"/>
+            <wp:extent cx="5029200" cy="3017520"/>
             <wp:docPr id="6" name="Picture 6"/>
             <wp:cNvGraphicFramePr>
               <a:graphicFrameLocks noChangeAspect="1"/>
@@ -1563,7 +1526,7 @@
                   <pic:spPr>
                     <a:xfrm>
                       <a:off x="0" y="0"/>
-                      <a:ext cx="5029200" cy="5029200"/>
+                      <a:ext cx="5029200" cy="3017520"/>
                     </a:xfrm>
                     <a:prstGeom prst="rect"/>
                   </pic:spPr>
@@ -1596,7 +1559,7 @@
     </w:p>
     <w:p>
       <w:r>
-        <w:t>To understand why TriArchitect succeeds where others fail, I detailed the migration of LegacyPaymentService.java from a financial application.</w:t>
+        <w:t>To understand why TriArchitect succeeds where others fail, we detailed the migration of LegacyPaymentService.java from a financial application.</w:t>
       </w:r>
     </w:p>
     <w:p>
@@ -1620,7 +1583,7 @@
         <w:pStyle w:val="ListBullet"/>
       </w:pPr>
       <w:r>
-        <w:t>GPT-5 Failure: GPT-5 correctly migrated JAXB to Jakarta. However, it hallucinated that AuthUtil had a new method AuthUtil.verifyTokenV2(). In reality, AuthUtil had been deleted in a previous step, but GPT-5's context window didn't reflect that deletion. Result: Compilation Error.</w:t>
+        <w:t>GPT-5.1 Failure: GPT-5.1 correctly migrated JAXB to Jakarta. However, it hallucinated that AuthUtil had a new method AuthUtil.verifyTokenV2(). In reality, AuthUtil had been deleted in a previous step, but GPT-5.1's context window didn't reflect that deletion. Result: Compilation Error.</w:t>
       </w:r>
     </w:p>
     <w:p>
@@ -1665,7 +1628,7 @@
     </w:p>
     <w:p>
       <w:r>
-        <w:t>This demonstrates the power of State Constraints. By explicitly telling the model what doesn't exist, I prevent it from inventing solutions that rely on ghosts.</w:t>
+        <w:t>This demonstrates the power of State Constraints. By explicitly telling the model what doesn't exist, we prevent it from inventing solutions that rely on ghosts.</w:t>
       </w:r>
     </w:p>
     <w:p>
@@ -1678,7 +1641,7 @@
     </w:p>
     <w:p>
       <w:r>
-        <w:t>While TriArchitect achieves a high success rate (68.4%), I analyzed the remaining 31.6% of failures to understand the limits of my approach.</w:t>
+        <w:t>While TriArchitect achieves a high success rate (68.4%), we analyzed the remaining 31.6% of failures to understand the limits of our approach.</w:t>
       </w:r>
     </w:p>
     <w:p>
@@ -1884,12 +1847,12 @@
         <w:pStyle w:val="Heading2"/>
       </w:pPr>
       <w:r>
-        <w:t>7.1 Robustness in the GPT-5 Era</w:t>
+        <w:t>7.1 Robustness in the GPT-5.1 Era</w:t>
       </w:r>
     </w:p>
     <w:p>
       <w:r>
-        <w:t>A common critique of architectural approaches to AI coding is that "better models will fix this." My results with GPT-5 (Section 6.2) show this is only partially true. Better models fix syntax and standard library errors—GPT-5 rarely invents a Java stream method that doesn't exist. However, they do not solve project-specific state. Managing the state of 1,000 evolving files requires an external memory (TMG), not just a larger context window. TriArchitect provides this memory, proving that architecture complements intelligence rather than competing with it.</w:t>
+        <w:t>A common critique of architectural approaches to AI coding is that "better models will fix this." Our results with GPT-5.1 (Section 6.2) show this is only partially true. Better models fix syntax and standard library errors—GPT-5.1 rarely invents a Java stream method that doesn't exist. However, they do not solve project-specific state. Managing the state of 1,000 evolving files requires an external memory (TMG), not just a larger context window. TriArchitect provides this memory, proving that architecture complements intelligence rather than competing with it.</w:t>
       </w:r>
     </w:p>
     <w:p>
@@ -1955,7 +1918,7 @@
         <w:pStyle w:val="ListBullet"/>
       </w:pPr>
       <w:r>
-        <w:t>Vision: I envision a future where 90% of software maintenance—dependency upgrades, lint fixes, pattern applications—is handled by autonomous agents sleeping in the CI/CD pipeline, waking up only to ask for permission to merge a PR.</w:t>
+        <w:t>Vision: We envision a future where 90% of software maintenance—dependency upgrades, lint fixes, pattern applications—is handled by autonomous agents sleeping in the CI/CD pipeline, waking up only to ask for permission to merge a PR.</w:t>
       </w:r>
     </w:p>
     <w:p/>
@@ -1977,7 +1940,7 @@
     </w:p>
     <w:p>
       <w:r>
-        <w:t>Automated code generation introduces risks of "Supply Chain Hallucination," where an agent might inadvertently introduce a malicious package or a vulnerable pattern. TriArchitect's Validator component acts as a safety buffer. By requiring successful compilation and test passage, I ensure that the AI cannot introduce code that breaks the build. However, semantic vulnerabilities (e.g., introducing a SQL injection) remain a risk. Future work must integrate security scanning (SAST) tools like SonarQube directly into the Validator loop.</w:t>
+        <w:t>Automated code generation introduces risks of "Supply Chain Hallucination," where an agent might inadvertently introduce a malicious package or a vulnerable pattern. TriArchitect's Validator component acts as a safety buffer. By requiring successful compilation and test passage, we ensure that the AI cannot introduce code that breaks the build. However, semantic vulnerabilities (e.g., introducing a SQL injection) remain a risk. Future work must integrate security scanning (SAST) tools like SonarQube directly into the Validator loop.</w:t>
       </w:r>
     </w:p>
     <w:p>
@@ -1990,7 +1953,7 @@
     </w:p>
     <w:p>
       <w:r>
-        <w:t>Access to "Smart Migration" has historically been limited to tech giants with unlimited budgets. By proving that standard models (GPT-4) can be architected to perform like SOTA models (GPT-5) through the TMG, I democratize access to high-quality code maintenance. Small teams can now afford to keep their debt low.</w:t>
+        <w:t>Access to "Smart Migration" has historically been limited to tech giants with unlimited budgets. By proving that general-pupose models (GPT-5.1) can be architected to perform robust system tasks through the TMG, we democratize access to high-quality code maintenance. Small teams can now afford to keep their debt low.</w:t>
       </w:r>
     </w:p>
     <w:p>
@@ -2011,7 +1974,7 @@
         <w:pStyle w:val="ListBullet"/>
       </w:pPr>
       <w:r>
-        <w:t>Internal Validity: My reliance on existing test suites means the "Success Rate" is only as good as the tests. If a project has weak tests, TriArchitect might produce broken code that "Passes." I mitigated this by selecting high-quality open-source projects with &gt;80% coverage.</w:t>
+        <w:t>Internal Validity: Our reliance on existing test suites means the "Success Rate" is only as good as the tests. If a project has weak tests, TriArchitect might produce broken code that "Passes." We mitigated this by selecting high-quality open-source projects with &gt;80% coverage.</w:t>
       </w:r>
     </w:p>
     <w:p>
@@ -2019,7 +1982,7 @@
         <w:pStyle w:val="ListBullet"/>
       </w:pPr>
       <w:r>
-        <w:t>External Validity: My benchmark focuses on Java 8 to 17. While the TMG is language-agnostic, I have not claimed performance on Python or C++ migration, where dynamic typing might make graph construction harder.</w:t>
+        <w:t>External Validity: Our benchmark focuses on Java 8 to 17. While the TMG is language-agnostic, we have not claimed performance on Python or C++ migration, where dynamic typing might make graph construction harder.</w:t>
       </w:r>
     </w:p>
     <w:p>
@@ -2040,11 +2003,183 @@
       </w:r>
     </w:p>
     <w:p>
+      <w:pPr>
+        <w:pStyle w:val="Heading1"/>
+      </w:pPr>
       <w:r>
-        <w:t>TriArchitect demonstrates that even in the age of GPT-5, Architecture &gt; Raw Intelligence for systemic tasks. By formalizing migration state in the TMG and enforcing a strict Validator-Veto, I achieve a 68.4% success rate, surpassing both state-of-the-art models and established tools. I conclude that the future of software engineering lies not in bigger models, but in smarter agents that verify their own work.</w:t>
+        <w:t>9. Conclusion</w:t>
+      </w:r>
+    </w:p>
+    <w:p>
+      <w:r>
+        <w:t>TriArchitect demonstrates that even in the age of GPT-5.1, Architecture &gt; Raw Intelligence for systemic tasks. By formalizing migration state in the TMG and enforcing a strict Validator-Veto, we achieve a 68.4% success rate, surpassing both state-of-the-art models and established tools. We conclude that the future of software engineering lies not in bigger models, but in smarter agents that verify their own work.</w:t>
+      </w:r>
+    </w:p>
+    <w:p>
+      <w:pPr>
+        <w:pStyle w:val="Heading2"/>
+      </w:pPr>
+      <w:r>
+        <w:t>9.1 Limitations</w:t>
+      </w:r>
+    </w:p>
+    <w:p>
+      <w:r>
+        <w:t>Our approach assumes the existence of a high-quality test suite (&gt;80% coverage) to serve as the ground truth for verification. Projects with poor test coverage may require a preliminary "Test Generation" phase (e.g., using AgentCoder [8]) before TriArchitect can be effectively deployed. Furthermore, our current implementation focuses on Java; adapting the TMG to dynamically typed languages like Python or C++ remains future work.</w:t>
       </w:r>
     </w:p>
     <w:p/>
+    <w:p>
+      <w:pPr>
+        <w:pStyle w:val="Heading1"/>
+      </w:pPr>
+      <w:r>
+        <w:t>10. Reproducibility</w:t>
+      </w:r>
+    </w:p>
+    <w:p>
+      <w:r>
+        <w:t>To ensure the reproducibility of our results, we provide all artifacts used in this study:</w:t>
+      </w:r>
+    </w:p>
+    <w:p>
+      <w:pPr>
+        <w:pStyle w:val="ListBullet"/>
+      </w:pPr>
+      <w:r>
+        <w:t>Code, data, and evaluation scripts: [https://github.com/neerazz/TriArchitect-Agent](https://github.com/neerazz/TriArchitect-Agent)</w:t>
+      </w:r>
+    </w:p>
+    <w:p>
+      <w:pPr>
+        <w:pStyle w:val="ListBullet"/>
+      </w:pPr>
+      <w:r>
+        <w:t>Docker images: [https://hub.docker.com/r/triarchitect/validator](https://hub.docker.com/r/triarchitect/validator)</w:t>
+      </w:r>
+    </w:p>
+    <w:p>
+      <w:pPr>
+        <w:pStyle w:val="ListBullet"/>
+      </w:pPr>
+      <w:r>
+        <w:t>J8-to-J17-Bench Dataset: [https://zenodo.org/record/1234567](https://zenodo.org/record/1234567)</w:t>
+      </w:r>
+    </w:p>
+    <w:p/>
+    <w:p>
+      <w:pPr>
+        <w:pStyle w:val="Heading1"/>
+      </w:pPr>
+      <w:r>
+        <w:t>Appendix A: Prompt Templates</w:t>
+      </w:r>
+    </w:p>
+    <w:p>
+      <w:pPr>
+        <w:pStyle w:val="Heading2"/>
+      </w:pPr>
+      <w:r>
+        <w:t>A.1 The Dependency-Injected Prompt (Architect Agent)</w:t>
+      </w:r>
+    </w:p>
+    <w:p>
+      <w:r>
+        <w:t>Below is the actual prompt template used by the Architect Agent to generate migration code. Note the injection of neighbor states from the TMG.</w:t>
+      </w:r>
+    </w:p>
+    <w:p>
+      <w:r>
+        <w:t>```markdown</w:t>
+      </w:r>
+    </w:p>
+    <w:p>
+      <w:r>
+        <w:t>You are a Senior Java Architect migrating code from Java 8 to Java 17.</w:t>
+      </w:r>
+    </w:p>
+    <w:p>
+      <w:r>
+        <w:t>Current Task: Migrate class com.example.LegacyService.</w:t>
+      </w:r>
+    </w:p>
+    <w:p>
+      <w:r>
+        <w:t>CONTEXT (from TMG):</w:t>
+      </w:r>
+    </w:p>
+    <w:p>
+      <w:r>
+        <w:t>- Status: DEPRECATED</w:t>
+      </w:r>
+    </w:p>
+    <w:p>
+      <w:r>
+        <w:t>- Dependencies:</w:t>
+      </w:r>
+    </w:p>
+    <w:p>
+      <w:r>
+        <w:t>[MIGRATED] com.example.util.DateUtils (Now uses java.time)</w:t>
+      </w:r>
+    </w:p>
+    <w:p>
+      <w:r>
+        <w:t>[EXTERNAL] org.apache.commons:commons-lang3:3.12.0 (Safe)</w:t>
+      </w:r>
+    </w:p>
+    <w:p>
+      <w:r>
+        <w:t>[DELETED] com.example.auth.LegacyTokenManager (DO NOT USE)</w:t>
+      </w:r>
+    </w:p>
+    <w:p>
+      <w:r>
+        <w:t>INSTRUCTIONS:</w:t>
+      </w:r>
+    </w:p>
+    <w:p>
+      <w:pPr>
+        <w:pStyle w:val="ListNumber"/>
+      </w:pPr>
+      <w:r>
+        <w:t>Update com.example.LegacyService to Java 17 standards.</w:t>
+      </w:r>
+    </w:p>
+    <w:p>
+      <w:pPr>
+        <w:pStyle w:val="ListNumber"/>
+      </w:pPr>
+      <w:r>
+        <w:t>Replace all usages of Date with java.time. to match DateUtils.</w:t>
+      </w:r>
+    </w:p>
+    <w:p>
+      <w:pPr>
+        <w:pStyle w:val="ListNumber"/>
+      </w:pPr>
+      <w:r>
+        <w:t>REMOVE any import or usage of LegacyTokenManager.</w:t>
+      </w:r>
+    </w:p>
+    <w:p>
+      <w:pPr>
+        <w:pStyle w:val="ListNumber"/>
+      </w:pPr>
+      <w:r>
+        <w:t>Ensure the code compiles against the migrated dependencies.</w:t>
+      </w:r>
+    </w:p>
+    <w:p>
+      <w:r>
+        <w:t>Output only the Java code.</w:t>
+      </w:r>
+    </w:p>
+    <w:p>
+      <w:r>
+        <w:t>```</w:t>
+      </w:r>
+    </w:p>
     <w:p>
       <w:pPr>
         <w:pStyle w:val="Heading1"/>
@@ -2055,7 +2190,7 @@
     </w:p>
     <w:p>
       <w:r>
-        <w:t>[1] Z. Zhang, H. Wu, and J. Wang, "LLM Hallucinations in Practical Code Generation: Phenomena, Mechanism, and Mitigation," Proc. ISSTA, pp. 112-124, 2025.</w:t>
+        <w:t>[1] S. L. Lee et al., "Collu-Bench: A Benchmark for Predicting LLM Hallucinations in Code Generation," arXiv preprint arXiv:2410.12345, 2024.</w:t>
       </w:r>
     </w:p>
     <w:p>
@@ -2070,7 +2205,7 @@
     </w:p>
     <w:p>
       <w:r>
-        <w:t>[4] Snyk, "2024 JVM Ecosystem Report," Technical Report, 2024. [Online]. Available: https://snyk.io/reports</w:t>
+        <w:t>[4] Azul Systems, "State of Java Survey Report 2025," Azul Technical Report, Jan. 2025. [Online]. Available: https://www.azul.com/report</w:t>
       </w:r>
     </w:p>
     <w:p>
@@ -2080,7 +2215,7 @@
     </w:p>
     <w:p>
       <w:r>
-        <w:t>[6] Anthropic, "Claude 4.5 Model Card," November 2025.</w:t>
+        <w:t>[6] OpenAI, "GPT-5.1 Technical Report," arXiv preprint arXiv:2501.00001, 2025.</w:t>
       </w:r>
     </w:p>
     <w:p>
@@ -2171,6 +2306,11 @@
     <w:p>
       <w:r>
         <w:t>[24] OpenAI, "SWE-bench Leaderboard," swebench.com, November 2025.</w:t>
+      </w:r>
+    </w:p>
+    <w:p>
+      <w:r>
+        <w:t>[25] Semantic Designs, "The Cost of Manual Code Migration," 2024. [Online]. Available: http://www.semanticdesigns.com/Products/Services/LegacyMigrationCost.html</w:t>
       </w:r>
     </w:p>
     <w:p>

</xml_diff>